<commit_message>
Propuesta: inmueble ya construido, propiedad horizontal y honorarios
Co-Authored-By: Claude Sonnet 5.5 <noreply@anthropic.com>
Claude-Session: https://claude.ai/code/session_019boFX5odZkLWFfCtRDzCTx
</commit_message>
<xml_diff>
--- a/propuesta_recibo_casa_terraza/Propuesta_recibo_Casa_Terraza.docx
+++ b/propuesta_recibo_casa_terraza/Propuesta_recibo_Casa_Terraza.docx
@@ -192,7 +192,76 @@
                 <w:sz w:val="19"/>
                 <w:szCs w:val="19"/>
               </w:rPr>
-              <w:t xml:space="preserve">Casa Terraza – vivienda unifamiliar de dos pisos</w:t>
+              <w:t xml:space="preserve">Casa Terraza – vivienda unifamiliar de dos pisos, ya construida</w:t>
+            </w:r>
+          </w:p>
+        </w:tc>
+      </w:tr>
+      <w:tr>
+        <w:trPr>
+          <w:cantSplit/>
+        </w:trPr>
+        <w:tc>
+          <w:tcPr>
+            <w:tcW w:type="dxa" w:w="2600"/>
+            <w:tcBorders>
+              <w:top w:val="single" w:color="9AA5A0" w:sz="4"/>
+              <w:left w:val="single" w:color="9AA5A0" w:sz="4"/>
+              <w:bottom w:val="single" w:color="9AA5A0" w:sz="4"/>
+              <w:right w:val="single" w:color="9AA5A0" w:sz="4"/>
+            </w:tcBorders>
+            <w:tcMar>
+              <w:top w:type="dxa" w:w="60"/>
+              <w:left w:type="dxa" w:w="100"/>
+              <w:bottom w:type="dxa" w:w="60"/>
+              <w:right w:type="dxa" w:w="100"/>
+            </w:tcMar>
+          </w:tcPr>
+          <w:p>
+            <w:pPr>
+              <w:spacing w:after="0"/>
+            </w:pPr>
+            <w:r>
+              <w:rPr>
+                <w:rFonts w:ascii="Arial" w:cs="Arial" w:eastAsia="Arial" w:hAnsi="Arial"/>
+                <w:b w:val="false"/>
+                <w:bCs w:val="false"/>
+                <w:sz w:val="19"/>
+                <w:szCs w:val="19"/>
+              </w:rPr>
+              <w:t xml:space="preserve">Régimen</w:t>
+            </w:r>
+          </w:p>
+        </w:tc>
+        <w:tc>
+          <w:tcPr>
+            <w:tcW w:type="dxa" w:w="6760"/>
+            <w:tcBorders>
+              <w:top w:val="single" w:color="9AA5A0" w:sz="4"/>
+              <w:left w:val="single" w:color="9AA5A0" w:sz="4"/>
+              <w:bottom w:val="single" w:color="9AA5A0" w:sz="4"/>
+              <w:right w:val="single" w:color="9AA5A0" w:sz="4"/>
+            </w:tcBorders>
+            <w:tcMar>
+              <w:top w:type="dxa" w:w="60"/>
+              <w:left w:type="dxa" w:w="100"/>
+              <w:bottom w:type="dxa" w:w="60"/>
+              <w:right w:type="dxa" w:w="100"/>
+            </w:tcMar>
+          </w:tcPr>
+          <w:p>
+            <w:pPr>
+              <w:spacing w:after="0"/>
+            </w:pPr>
+            <w:r>
+              <w:rPr>
+                <w:rFonts w:ascii="Arial" w:cs="Arial" w:eastAsia="Arial" w:hAnsi="Arial"/>
+                <w:b w:val="false"/>
+                <w:bCs w:val="false"/>
+                <w:sz w:val="19"/>
+                <w:szCs w:val="19"/>
+              </w:rPr>
+              <w:t xml:space="preserve">Conjunto cerrado, sometido a propiedad horizontal (Ley 675 de 2001)</w:t>
             </w:r>
           </w:p>
         </w:tc>
@@ -1137,6 +1206,29 @@
         </w:tc>
       </w:tr>
     </w:tbl>
+    <w:p>
+      <w:pPr>
+        <w:spacing w:after="120" w:before="100"/>
+      </w:pPr>
+      <w:r>
+        <w:rPr>
+          <w:rFonts w:ascii="Arial" w:cs="Arial" w:eastAsia="Arial" w:hAnsi="Arial"/>
+          <w:b/>
+          <w:bCs/>
+          <w:sz w:val="21"/>
+          <w:szCs w:val="21"/>
+        </w:rPr>
+        <w:t xml:space="preserve">Condición del inmueble: </w:t>
+      </w:r>
+      <w:r>
+        <w:rPr>
+          <w:rFonts w:ascii="Arial" w:cs="Arial" w:eastAsia="Arial" w:hAnsi="Arial"/>
+          <w:sz w:val="21"/>
+          <w:szCs w:val="21"/>
+        </w:rPr>
+        <w:t xml:space="preserve">la vivienda ya está construida y hace parte de un conjunto cerrado que estará bajo régimen de propiedad horizontal. Por eso el recibo se concentra en la unidad privada (la casa y sus patios, garaje y antejardín privados) y en los documentos que la soportan, incluidos los propios de la propiedad horizontal.</w:t>
+      </w:r>
+    </w:p>
     <w:p>
       <w:pPr>
         <w:spacing w:after="120" w:before="100"/>
@@ -1889,7 +1981,7 @@
           <w:sz w:val="21"/>
           <w:szCs w:val="21"/>
         </w:rPr>
-        <w:t xml:space="preserve">Garantías y manuales: </w:t>
+        <w:t xml:space="preserve">Propiedad horizontal: </w:t>
       </w:r>
       <w:r>
         <w:rPr>
@@ -1897,47 +1989,7 @@
           <w:sz w:val="21"/>
           <w:szCs w:val="21"/>
         </w:rPr>
-        <w:t xml:space="preserve">garantías de equipos, ventanería, impermeabilización, cocina, aparatos y acabados; manuales de uso y mantenimiento; cartilla del propietario.</w:t>
-      </w:r>
-    </w:p>
-    <w:p>
-      <w:pPr>
-        <w:spacing w:after="120" w:before="100"/>
-      </w:pPr>
-      <w:r>
-        <w:rPr>
-          <w:rFonts w:ascii="Arial" w:cs="Arial" w:eastAsia="Arial" w:hAnsi="Arial"/>
-          <w:b/>
-          <w:bCs/>
-          <w:sz w:val="21"/>
-          <w:szCs w:val="21"/>
-        </w:rPr>
-        <w:t xml:space="preserve">Entregable de la etapa: </w:t>
-      </w:r>
-      <w:r>
-        <w:rPr>
-          <w:rFonts w:ascii="Arial" w:cs="Arial" w:eastAsia="Arial" w:hAnsi="Arial"/>
-          <w:sz w:val="21"/>
-          <w:szCs w:val="21"/>
-        </w:rPr>
-        <w:t xml:space="preserve">Informe documental (matriz de verificación: recibido / faltante / observación) con la lista de documentos que el constructor debe completar antes o junto con la entrega.</w:t>
-      </w:r>
-    </w:p>
-    <w:p>
-      <w:pPr>
-        <w:pStyle w:val="Heading2"/>
-        <w:keepNext/>
-        <w:spacing w:after="80" w:before="200"/>
-      </w:pPr>
-      <w:r>
-        <w:rPr>
-          <w:rFonts w:ascii="Arial" w:cs="Arial" w:eastAsia="Arial" w:hAnsi="Arial"/>
-          <w:b/>
-          <w:bCs/>
-          <w:sz w:val="22"/>
-          <w:szCs w:val="22"/>
-        </w:rPr>
-        <w:t xml:space="preserve">4.3 Plan de inspección</w:t>
+        <w:t xml:space="preserve">escritura de constitución del reglamento de propiedad horizontal (o su estado de trámite), coeficientes de copropiedad y cuadro de áreas privadas y comunes, escritura y certificado de tradición y libertad de la unidad, paz y salvo de cuotas de administración, reglamento y manual de convivencia (restricciones de fachada, mascotas, modificaciones), y relación de bienes comunes de uso exclusivo (por ejemplo, parqueaderos) si los hubiera.</w:t>
       </w:r>
     </w:p>
     <w:p>
@@ -1952,10 +2004,60 @@
       <w:r>
         <w:rPr>
           <w:rFonts w:ascii="Arial" w:cs="Arial" w:eastAsia="Arial" w:hAnsi="Arial"/>
+          <w:b/>
+          <w:bCs/>
           <w:sz w:val="21"/>
           <w:szCs w:val="21"/>
         </w:rPr>
-        <w:t xml:space="preserve">Checklist por espacio y por sistema, adaptado a esta vivienda a partir de los planos (Anexo A).</w:t>
+        <w:t xml:space="preserve">Garantías y manuales: </w:t>
+      </w:r>
+      <w:r>
+        <w:rPr>
+          <w:rFonts w:ascii="Arial" w:cs="Arial" w:eastAsia="Arial" w:hAnsi="Arial"/>
+          <w:sz w:val="21"/>
+          <w:szCs w:val="21"/>
+        </w:rPr>
+        <w:t xml:space="preserve">garantías de equipos, ventanería, impermeabilización, cocina, aparatos y acabados; manuales de uso y mantenimiento; cartilla del propietario.</w:t>
+      </w:r>
+    </w:p>
+    <w:p>
+      <w:pPr>
+        <w:spacing w:after="120" w:before="100"/>
+      </w:pPr>
+      <w:r>
+        <w:rPr>
+          <w:rFonts w:ascii="Arial" w:cs="Arial" w:eastAsia="Arial" w:hAnsi="Arial"/>
+          <w:b/>
+          <w:bCs/>
+          <w:sz w:val="21"/>
+          <w:szCs w:val="21"/>
+        </w:rPr>
+        <w:t xml:space="preserve">Entregable de la etapa: </w:t>
+      </w:r>
+      <w:r>
+        <w:rPr>
+          <w:rFonts w:ascii="Arial" w:cs="Arial" w:eastAsia="Arial" w:hAnsi="Arial"/>
+          <w:sz w:val="21"/>
+          <w:szCs w:val="21"/>
+        </w:rPr>
+        <w:t xml:space="preserve">Informe documental (matriz de verificación: recibido / faltante / observación) con la lista de documentos que el constructor debe completar antes o junto con la entrega.</w:t>
+      </w:r>
+    </w:p>
+    <w:p>
+      <w:pPr>
+        <w:pStyle w:val="Heading2"/>
+        <w:keepNext/>
+        <w:spacing w:after="80" w:before="200"/>
+      </w:pPr>
+      <w:r>
+        <w:rPr>
+          <w:rFonts w:ascii="Arial" w:cs="Arial" w:eastAsia="Arial" w:hAnsi="Arial"/>
+          <w:b/>
+          <w:bCs/>
+          <w:sz w:val="22"/>
+          <w:szCs w:val="22"/>
+        </w:rPr>
+        <w:t xml:space="preserve">4.3 Plan de inspección</w:t>
       </w:r>
     </w:p>
     <w:p>
@@ -1973,7 +2075,7 @@
           <w:sz w:val="21"/>
           <w:szCs w:val="21"/>
         </w:rPr>
-        <w:t xml:space="preserve">Definición de pruebas, equipos de medición e insumos necesarios y coordinación de acceso a servicios (agua, energía, gas) el día de la visita.</w:t>
+        <w:t xml:space="preserve">Checklist por espacio y por sistema, adaptado a esta vivienda a partir de los planos (Anexo A).</w:t>
       </w:r>
     </w:p>
     <w:p>
@@ -1991,55 +2093,7 @@
           <w:sz w:val="21"/>
           <w:szCs w:val="21"/>
         </w:rPr>
-        <w:t xml:space="preserve">Coordinación con la constructora de fecha, hora y duración de la inspección.</w:t>
-      </w:r>
-    </w:p>
-    <w:p>
-      <w:pPr>
-        <w:pStyle w:val="Heading1"/>
-        <w:keepNext/>
-        <w:spacing w:after="120" w:before="320"/>
-      </w:pPr>
-      <w:r>
-        <w:rPr>
-          <w:rFonts w:ascii="Arial" w:cs="Arial" w:eastAsia="Arial" w:hAnsi="Arial"/>
-          <w:b/>
-          <w:bCs/>
-          <w:color w:val="2F5D50"/>
-          <w:sz w:val="27"/>
-          <w:szCs w:val="27"/>
-        </w:rPr>
-        <w:t xml:space="preserve">5. Etapa B – Durante la entrega</w:t>
-      </w:r>
-    </w:p>
-    <w:p>
-      <w:pPr>
-        <w:pStyle w:val="Heading2"/>
-        <w:keepNext/>
-        <w:spacing w:after="80" w:before="200"/>
-      </w:pPr>
-      <w:r>
-        <w:rPr>
-          <w:rFonts w:ascii="Arial" w:cs="Arial" w:eastAsia="Arial" w:hAnsi="Arial"/>
-          <w:b/>
-          <w:bCs/>
-          <w:sz w:val="22"/>
-          <w:szCs w:val="22"/>
-        </w:rPr>
-        <w:t xml:space="preserve">5.1 Inspección física en sitio</w:t>
-      </w:r>
-    </w:p>
-    <w:p>
-      <w:pPr>
-        <w:spacing w:after="120" w:line="276"/>
-      </w:pPr>
-      <w:r>
-        <w:rPr>
-          <w:rFonts w:ascii="Arial" w:cs="Arial" w:eastAsia="Arial" w:hAnsi="Arial"/>
-          <w:sz w:val="21"/>
-          <w:szCs w:val="21"/>
-        </w:rPr>
-        <w:t xml:space="preserve">Inspección técnica detallada de toda la vivienda, con registro fotográfico y marcación de cada hallazgo. Incluye, entre otros:</w:t>
+        <w:t xml:space="preserve">Definición de pruebas, equipos de medición e insumos necesarios y coordinación de acceso a servicios (agua, energía, gas) el día de la visita.</w:t>
       </w:r>
     </w:p>
     <w:p>
@@ -2054,20 +2108,58 @@
       <w:r>
         <w:rPr>
           <w:rFonts w:ascii="Arial" w:cs="Arial" w:eastAsia="Arial" w:hAnsi="Arial"/>
+          <w:sz w:val="21"/>
+          <w:szCs w:val="21"/>
+        </w:rPr>
+        <w:t xml:space="preserve">Coordinación con la constructora de fecha, hora y duración de la inspección.</w:t>
+      </w:r>
+    </w:p>
+    <w:p>
+      <w:pPr>
+        <w:pStyle w:val="Heading1"/>
+        <w:keepNext/>
+        <w:spacing w:after="120" w:before="320"/>
+      </w:pPr>
+      <w:r>
+        <w:rPr>
+          <w:rFonts w:ascii="Arial" w:cs="Arial" w:eastAsia="Arial" w:hAnsi="Arial"/>
           <w:b/>
           <w:bCs/>
+          <w:color w:val="2F5D50"/>
+          <w:sz w:val="27"/>
+          <w:szCs w:val="27"/>
+        </w:rPr>
+        <w:t xml:space="preserve">5. Etapa B – Durante la entrega</w:t>
+      </w:r>
+    </w:p>
+    <w:p>
+      <w:pPr>
+        <w:pStyle w:val="Heading2"/>
+        <w:keepNext/>
+        <w:spacing w:after="80" w:before="200"/>
+      </w:pPr>
+      <w:r>
+        <w:rPr>
+          <w:rFonts w:ascii="Arial" w:cs="Arial" w:eastAsia="Arial" w:hAnsi="Arial"/>
+          <w:b/>
+          <w:bCs/>
+          <w:sz w:val="22"/>
+          <w:szCs w:val="22"/>
+        </w:rPr>
+        <w:t xml:space="preserve">5.1 Inspección física en sitio</w:t>
+      </w:r>
+    </w:p>
+    <w:p>
+      <w:pPr>
+        <w:spacing w:after="120" w:line="276"/>
+      </w:pPr>
+      <w:r>
+        <w:rPr>
+          <w:rFonts w:ascii="Arial" w:cs="Arial" w:eastAsia="Arial" w:hAnsi="Arial"/>
           <w:sz w:val="21"/>
           <w:szCs w:val="21"/>
         </w:rPr>
-        <w:t xml:space="preserve">Estructura y obra gris: </w:t>
-      </w:r>
-      <w:r>
-        <w:rPr>
-          <w:rFonts w:ascii="Arial" w:cs="Arial" w:eastAsia="Arial" w:hAnsi="Arial"/>
-          <w:sz w:val="21"/>
-          <w:szCs w:val="21"/>
-        </w:rPr>
-        <w:t xml:space="preserve">fisuras y grietas, plomos, niveles y escuadras, calidad de muros, placas, vigas y escaleras, vacío y barandas, y cumplimiento visible de lo indicado en planos.</w:t>
+        <w:t xml:space="preserve">Inspección técnica detallada de toda la vivienda, con registro fotográfico y marcación de cada hallazgo. Incluye, entre otros:</w:t>
       </w:r>
     </w:p>
     <w:p>
@@ -2087,7 +2179,7 @@
           <w:sz w:val="21"/>
           <w:szCs w:val="21"/>
         </w:rPr>
-        <w:t xml:space="preserve">Cubierta, terrazas e impermeabilización: </w:t>
+        <w:t xml:space="preserve">Estructura y obra gris: </w:t>
       </w:r>
       <w:r>
         <w:rPr>
@@ -2095,7 +2187,7 @@
           <w:sz w:val="21"/>
           <w:szCs w:val="21"/>
         </w:rPr>
-        <w:t xml:space="preserve">pendientes, empozamientos, remates, bajantes, canales y desagües; prueba de estanqueidad o inspección de humedades cuando sea viable.</w:t>
+        <w:t xml:space="preserve">fisuras y grietas, plomos, niveles y escuadras, calidad de muros, placas, vigas y escaleras, vacío y barandas, y cumplimiento visible de lo indicado en planos.</w:t>
       </w:r>
     </w:p>
     <w:p>
@@ -2115,7 +2207,7 @@
           <w:sz w:val="21"/>
           <w:szCs w:val="21"/>
         </w:rPr>
-        <w:t xml:space="preserve">Redes hidrosanitarias: </w:t>
+        <w:t xml:space="preserve">Cubierta, terrazas e impermeabilización: </w:t>
       </w:r>
       <w:r>
         <w:rPr>
@@ -2123,7 +2215,7 @@
           <w:sz w:val="21"/>
           <w:szCs w:val="21"/>
         </w:rPr>
-        <w:t xml:space="preserve">presión y caudal, fugas, funcionamiento de aparatos sanitarios y griferías, sifones, desagües (zona de aseo, BBQ, terrazas, patios), ventilación y aguas lluvias.</w:t>
+        <w:t xml:space="preserve">pendientes, empozamientos, remates, bajantes, canales y desagües; prueba de estanqueidad o inspección de humedades cuando sea viable.</w:t>
       </w:r>
     </w:p>
     <w:p>
@@ -2143,7 +2235,7 @@
           <w:sz w:val="21"/>
           <w:szCs w:val="21"/>
         </w:rPr>
-        <w:t xml:space="preserve">Redes eléctricas y comunicaciones: </w:t>
+        <w:t xml:space="preserve">Redes hidrosanitarias: </w:t>
       </w:r>
       <w:r>
         <w:rPr>
@@ -2151,7 +2243,7 @@
           <w:sz w:val="21"/>
           <w:szCs w:val="21"/>
         </w:rPr>
-        <w:t xml:space="preserve">tablero y protecciones, tomas, interruptores e iluminación, polo a tierra, continuidad y circuitos, iluminación de fachada, puntos de datos/TV.</w:t>
+        <w:t xml:space="preserve">presión y caudal, fugas, funcionamiento de aparatos sanitarios y griferías, sifones, desagües (zona de aseo, BBQ, terrazas, patios), ventilación y aguas lluvias.</w:t>
       </w:r>
     </w:p>
     <w:p>
@@ -2171,7 +2263,7 @@
           <w:sz w:val="21"/>
           <w:szCs w:val="21"/>
         </w:rPr>
-        <w:t xml:space="preserve">Gas y equipos (si aplica): </w:t>
+        <w:t xml:space="preserve">Redes eléctricas y comunicaciones: </w:t>
       </w:r>
       <w:r>
         <w:rPr>
@@ -2179,7 +2271,7 @@
           <w:sz w:val="21"/>
           <w:szCs w:val="21"/>
         </w:rPr>
-        <w:t xml:space="preserve">estado visible de la red, ventilación, puntos de conexión y documentación de pruebas de hermeticidad.</w:t>
+        <w:t xml:space="preserve">tablero y protecciones, tomas, interruptores e iluminación, polo a tierra, continuidad y circuitos, iluminación de fachada, puntos de datos/TV.</w:t>
       </w:r>
     </w:p>
     <w:p>
@@ -2199,7 +2291,7 @@
           <w:sz w:val="21"/>
           <w:szCs w:val="21"/>
         </w:rPr>
-        <w:t xml:space="preserve">Carpintería y cerrajería: </w:t>
+        <w:t xml:space="preserve">Gas y equipos (si aplica): </w:t>
       </w:r>
       <w:r>
         <w:rPr>
@@ -2207,7 +2299,7 @@
           <w:sz w:val="21"/>
           <w:szCs w:val="21"/>
         </w:rPr>
-        <w:t xml:space="preserve">puertas, ventanas, ventanería, vidrios, cerraduras, closets, muebles de cocina y baños; funcionamiento, ajuste, sellos y accesorios.</w:t>
+        <w:t xml:space="preserve">estado visible de la red, ventilación, puntos de conexión y documentación de pruebas de hermeticidad.</w:t>
       </w:r>
     </w:p>
     <w:p>
@@ -2227,7 +2319,7 @@
           <w:sz w:val="21"/>
           <w:szCs w:val="21"/>
         </w:rPr>
-        <w:t xml:space="preserve">Acabados: </w:t>
+        <w:t xml:space="preserve">Carpintería y cerrajería: </w:t>
       </w:r>
       <w:r>
         <w:rPr>
@@ -2235,7 +2327,7 @@
           <w:sz w:val="21"/>
           <w:szCs w:val="21"/>
         </w:rPr>
-        <w:t xml:space="preserve">pisos y enchapes (incluida la piedra de fachada), pintura, estucos, cielos, juntas y remates; nivelación, sonido a hueco y manchas.</w:t>
+        <w:t xml:space="preserve">puertas, ventanas, ventanería, vidrios, cerraduras, closets, muebles de cocina y baños; funcionamiento, ajuste, sellos y accesorios.</w:t>
       </w:r>
     </w:p>
     <w:p>
@@ -2255,7 +2347,7 @@
           <w:sz w:val="21"/>
           <w:szCs w:val="21"/>
         </w:rPr>
-        <w:t xml:space="preserve">Exteriores: </w:t>
+        <w:t xml:space="preserve">Acabados: </w:t>
       </w:r>
       <w:r>
         <w:rPr>
@@ -2263,7 +2355,63 @@
           <w:sz w:val="21"/>
           <w:szCs w:val="21"/>
         </w:rPr>
-        <w:t xml:space="preserve">garaje, andenes, antejardín, zonas verdes, cerramiento y drenajes.</w:t>
+        <w:t xml:space="preserve">pisos y enchapes (incluida la piedra de fachada), pintura, estucos, cielos, juntas y remates; nivelación, sonido a hueco y manchas.</w:t>
+      </w:r>
+    </w:p>
+    <w:p>
+      <w:pPr>
+        <w:pStyle w:val="ListParagraph"/>
+        <w:numPr>
+          <w:ilvl w:val="0"/>
+          <w:numId w:val="2"/>
+        </w:numPr>
+        <w:spacing w:after="60" w:line="272"/>
+      </w:pPr>
+      <w:r>
+        <w:rPr>
+          <w:rFonts w:ascii="Arial" w:cs="Arial" w:eastAsia="Arial" w:hAnsi="Arial"/>
+          <w:b/>
+          <w:bCs/>
+          <w:sz w:val="21"/>
+          <w:szCs w:val="21"/>
+        </w:rPr>
+        <w:t xml:space="preserve">Exteriores: </w:t>
+      </w:r>
+      <w:r>
+        <w:rPr>
+          <w:rFonts w:ascii="Arial" w:cs="Arial" w:eastAsia="Arial" w:hAnsi="Arial"/>
+          <w:sz w:val="21"/>
+          <w:szCs w:val="21"/>
+        </w:rPr>
+        <w:t xml:space="preserve">garaje, andenes, antejardín, zonas verdes, cerramiento y drenajes de la unidad privada.</w:t>
+      </w:r>
+    </w:p>
+    <w:p>
+      <w:pPr>
+        <w:pStyle w:val="ListParagraph"/>
+        <w:numPr>
+          <w:ilvl w:val="0"/>
+          <w:numId w:val="2"/>
+        </w:numPr>
+        <w:spacing w:after="60" w:line="272"/>
+      </w:pPr>
+      <w:r>
+        <w:rPr>
+          <w:rFonts w:ascii="Arial" w:cs="Arial" w:eastAsia="Arial" w:hAnsi="Arial"/>
+          <w:b/>
+          <w:bCs/>
+          <w:sz w:val="21"/>
+          <w:szCs w:val="21"/>
+        </w:rPr>
+        <w:t xml:space="preserve">Interfaz con la copropiedad: </w:t>
+      </w:r>
+      <w:r>
+        <w:rPr>
+          <w:rFonts w:ascii="Arial" w:cs="Arial" w:eastAsia="Arial" w:hAnsi="Arial"/>
+          <w:sz w:val="21"/>
+          <w:szCs w:val="21"/>
+        </w:rPr>
+        <w:t xml:space="preserve">linderos y muros divisorios o medianeros con unidades vecinas (si los hay), acometidas y medidores individuales de agua, energía y gas, puntos de conexión con redes comunes, y que lo construido corresponda a las áreas privadas del reglamento.</w:t>
       </w:r>
     </w:p>
     <w:p>
@@ -5652,7 +5800,7 @@
           <w:sz w:val="21"/>
           <w:szCs w:val="21"/>
         </w:rPr>
-        <w:t xml:space="preserve">No incluye ensayos de laboratorio, extracción de núcleos, patología estructural, estudios de suelos ni auditoría del cumplimiento sismorresistente (NSR-10); si durante la inspección se detectan indicios, se recomendará y cotizará aparte el estudio especializado.</w:t>
+        <w:t xml:space="preserve">No incluye la inspección de zonas comunes del conjunto (vías, portería, zonas verdes, redes generales, cerramiento perimetral); su recibo corresponde a la administración o al comité de entrega de zonas comunes. Puede cotizarse aparte si el cliente lo requiere.</w:t>
       </w:r>
     </w:p>
     <w:p>
@@ -5670,7 +5818,7 @@
           <w:sz w:val="21"/>
           <w:szCs w:val="21"/>
         </w:rPr>
-        <w:t xml:space="preserve">No incluye certificaciones oficiales de redes (RETIE, gas, RETILAP), que corresponden a organismos acreditados; MAP verifica su existencia y coherencia.</w:t>
+        <w:t xml:space="preserve">No incluye ensayos de laboratorio, extracción de núcleos, patología estructural, estudios de suelos ni auditoría del cumplimiento sismorresistente (NSR-10); si durante la inspección se detectan indicios, se recomendará y cotizará aparte el estudio especializado.</w:t>
       </w:r>
     </w:p>
     <w:p>
@@ -5688,7 +5836,7 @@
           <w:sz w:val="21"/>
           <w:szCs w:val="21"/>
         </w:rPr>
-        <w:t xml:space="preserve">No incluye la ejecución de reparaciones ni la representación judicial o trámites ante autoridades o entidades de vigilancia; sí incluye los conceptos técnicos de soporte.</w:t>
+        <w:t xml:space="preserve">No incluye certificaciones oficiales de redes (RETIE, gas, RETILAP), que corresponden a organismos acreditados; MAP verifica su existencia y coherencia.</w:t>
       </w:r>
     </w:p>
     <w:p>
@@ -5706,7 +5854,7 @@
           <w:sz w:val="21"/>
           <w:szCs w:val="21"/>
         </w:rPr>
-        <w:t xml:space="preserve">Las áreas ocultas o inaccesibles el día de la visita (cielos cerrados, ductos, cimentación, redes enterradas) se evalúan solo con la documentación y evidencia disponibles.</w:t>
+        <w:t xml:space="preserve">No incluye la ejecución de reparaciones ni la representación judicial o trámites ante autoridades o entidades de vigilancia; sí incluye los conceptos técnicos de soporte.</w:t>
       </w:r>
     </w:p>
     <w:p>
@@ -5724,6 +5872,24 @@
           <w:sz w:val="21"/>
           <w:szCs w:val="21"/>
         </w:rPr>
+        <w:t xml:space="preserve">Las áreas ocultas o inaccesibles el día de la visita (cielos cerrados, ductos, cimentación, redes enterradas) se evalúan solo con la documentación y evidencia disponibles.</w:t>
+      </w:r>
+    </w:p>
+    <w:p>
+      <w:pPr>
+        <w:pStyle w:val="ListParagraph"/>
+        <w:numPr>
+          <w:ilvl w:val="0"/>
+          <w:numId w:val="2"/>
+        </w:numPr>
+        <w:spacing w:after="60" w:line="272"/>
+      </w:pPr>
+      <w:r>
+        <w:rPr>
+          <w:rFonts w:ascii="Arial" w:cs="Arial" w:eastAsia="Arial" w:hAnsi="Arial"/>
+          <w:sz w:val="21"/>
+          <w:szCs w:val="21"/>
+        </w:rPr>
         <w:t xml:space="preserve">Visitas adicionales a las incluidas (por ejemplo, por correcciones tardías o nuevas inspecciones) se facturan según tarifa por visita acordada.</w:t>
       </w:r>
     </w:p>
@@ -5755,7 +5921,7 @@
           <w:sz w:val="21"/>
           <w:szCs w:val="21"/>
         </w:rPr>
-        <w:t xml:space="preserve">Los criterios de revisión se apoyan, según aplique al proyecto y a lo que indique la licencia, en: planos y especificaciones aprobadas; Reglamento NSR-10; RETIE y RETILAP; normas técnicas de instalaciones hidrosanitarias y de gas; Decreto 1077 de 2015 (licencias y trámites de ocupación); Ley 1480 de 2011 (Estatuto del Consumidor) y Ley 1796 de 2016 (vivienda segura y garantías). La aplicación concreta de cada norma se confirmará con los documentos del proyecto.</w:t>
+        <w:t xml:space="preserve">Los criterios de revisión se apoyan, según aplique al proyecto y a lo que indique la licencia, en: planos y especificaciones aprobadas; Reglamento NSR-10; RETIE y RETILAP; normas técnicas de instalaciones hidrosanitarias y de gas; Decreto 1077 de 2015 (licencias y trámites de ocupación); Ley 1480 de 2011 (Estatuto del Consumidor) y Ley 1796 de 2016 (vivienda segura y garantías) y Ley 675 de 2001 (régimen de propiedad horizontal). La aplicación concreta de cada norma se confirmará con los documentos del proyecto.</w:t>
       </w:r>
     </w:p>
     <w:p>
@@ -5861,7 +6027,7 @@
                 <w:sz w:val="19"/>
                 <w:szCs w:val="19"/>
               </w:rPr>
-              <w:t xml:space="preserve">Valor</w:t>
+              <w:t xml:space="preserve">Valor (COP)</w:t>
             </w:r>
           </w:p>
         </w:tc>
@@ -5932,7 +6098,7 @@
                 <w:sz w:val="19"/>
                 <w:szCs w:val="19"/>
               </w:rPr>
-              <w:t xml:space="preserve">Etapa A: recibo documental y plan de inspección</w:t>
+              <w:t xml:space="preserve">Servicio integral: Etapas A, B y C (recibo documental y físico, acompañamiento en la entrega, reinspección, recibo final y 2 visitas de garantía)</w:t>
             </w:r>
           </w:p>
         </w:tc>
@@ -5964,7 +6130,7 @@
                 <w:sz w:val="19"/>
                 <w:szCs w:val="19"/>
               </w:rPr>
-              <w:t xml:space="preserve">$ [____]</w:t>
+              <w:t xml:space="preserve">$ 3.000.000</w:t>
             </w:r>
           </w:p>
         </w:tc>
@@ -5996,7 +6162,7 @@
                 <w:sz w:val="19"/>
                 <w:szCs w:val="19"/>
               </w:rPr>
-              <w:t xml:space="preserve"/>
+              <w:t xml:space="preserve">Valor base (honorarios)</w:t>
             </w:r>
           </w:p>
         </w:tc>
@@ -6033,7 +6199,7 @@
                 <w:sz w:val="19"/>
                 <w:szCs w:val="19"/>
               </w:rPr>
-              <w:t xml:space="preserve">Etapa B: inspección física, informe y acompañamiento en la entrega</w:t>
+              <w:t xml:space="preserve">IVA 19% (solo si MAP factura como responsable de IVA)</w:t>
             </w:r>
           </w:p>
         </w:tc>
@@ -6065,7 +6231,7 @@
                 <w:sz w:val="19"/>
                 <w:szCs w:val="19"/>
               </w:rPr>
-              <w:t xml:space="preserve">$ [____]</w:t>
+              <w:t xml:space="preserve">$ 570.000</w:t>
             </w:r>
           </w:p>
         </w:tc>
@@ -6097,7 +6263,7 @@
                 <w:sz w:val="19"/>
                 <w:szCs w:val="19"/>
               </w:rPr>
-              <w:t xml:space="preserve"/>
+              <w:t xml:space="preserve">Total facturado: $ 3.570.000</w:t>
             </w:r>
           </w:p>
         </w:tc>
@@ -6134,7 +6300,7 @@
                 <w:sz w:val="19"/>
                 <w:szCs w:val="19"/>
               </w:rPr>
-              <w:t xml:space="preserve">Etapa C: reinspección, recibo final y 2 visitas de garantía</w:t>
+              <w:t xml:space="preserve">Si el servicio lo presta una persona natural no responsable de IVA</w:t>
             </w:r>
           </w:p>
         </w:tc>
@@ -6166,7 +6332,7 @@
                 <w:sz w:val="19"/>
                 <w:szCs w:val="19"/>
               </w:rPr>
-              <w:t xml:space="preserve">$ [____]</w:t>
+              <w:t xml:space="preserve">$ 3.000.000</w:t>
             </w:r>
           </w:p>
         </w:tc>
@@ -6198,7 +6364,7 @@
                 <w:sz w:val="19"/>
                 <w:szCs w:val="19"/>
               </w:rPr>
-              <w:t xml:space="preserve"/>
+              <w:t xml:space="preserve">Sin IVA</w:t>
             </w:r>
           </w:p>
         </w:tc>
@@ -6235,107 +6401,6 @@
                 <w:sz w:val="19"/>
                 <w:szCs w:val="19"/>
               </w:rPr>
-              <w:t xml:space="preserve">Valor total del servicio</w:t>
-            </w:r>
-          </w:p>
-        </w:tc>
-        <w:tc>
-          <w:tcPr>
-            <w:tcW w:type="dxa" w:w="2530"/>
-            <w:tcBorders>
-              <w:top w:val="single" w:color="9AA5A0" w:sz="4"/>
-              <w:left w:val="single" w:color="9AA5A0" w:sz="4"/>
-              <w:bottom w:val="single" w:color="9AA5A0" w:sz="4"/>
-              <w:right w:val="single" w:color="9AA5A0" w:sz="4"/>
-            </w:tcBorders>
-            <w:tcMar>
-              <w:top w:type="dxa" w:w="60"/>
-              <w:left w:type="dxa" w:w="100"/>
-              <w:bottom w:type="dxa" w:w="60"/>
-              <w:right w:type="dxa" w:w="100"/>
-            </w:tcMar>
-          </w:tcPr>
-          <w:p>
-            <w:pPr>
-              <w:spacing w:after="0"/>
-            </w:pPr>
-            <w:r>
-              <w:rPr>
-                <w:rFonts w:ascii="Arial" w:cs="Arial" w:eastAsia="Arial" w:hAnsi="Arial"/>
-                <w:b w:val="false"/>
-                <w:bCs w:val="false"/>
-                <w:sz w:val="19"/>
-                <w:szCs w:val="19"/>
-              </w:rPr>
-              <w:t xml:space="preserve">$ [____]</w:t>
-            </w:r>
-          </w:p>
-        </w:tc>
-        <w:tc>
-          <w:tcPr>
-            <w:tcW w:type="dxa" w:w="2530"/>
-            <w:tcBorders>
-              <w:top w:val="single" w:color="9AA5A0" w:sz="4"/>
-              <w:left w:val="single" w:color="9AA5A0" w:sz="4"/>
-              <w:bottom w:val="single" w:color="9AA5A0" w:sz="4"/>
-              <w:right w:val="single" w:color="9AA5A0" w:sz="4"/>
-            </w:tcBorders>
-            <w:tcMar>
-              <w:top w:type="dxa" w:w="60"/>
-              <w:left w:type="dxa" w:w="100"/>
-              <w:bottom w:type="dxa" w:w="60"/>
-              <w:right w:type="dxa" w:w="100"/>
-            </w:tcMar>
-          </w:tcPr>
-          <w:p>
-            <w:pPr>
-              <w:spacing w:after="0"/>
-            </w:pPr>
-            <w:r>
-              <w:rPr>
-                <w:rFonts w:ascii="Arial" w:cs="Arial" w:eastAsia="Arial" w:hAnsi="Arial"/>
-                <w:b w:val="false"/>
-                <w:bCs w:val="false"/>
-                <w:sz w:val="19"/>
-                <w:szCs w:val="19"/>
-              </w:rPr>
-              <w:t xml:space="preserve">Incluye / no incluye IVA [___]</w:t>
-            </w:r>
-          </w:p>
-        </w:tc>
-      </w:tr>
-      <w:tr>
-        <w:trPr>
-          <w:cantSplit/>
-        </w:trPr>
-        <w:tc>
-          <w:tcPr>
-            <w:tcW w:type="dxa" w:w="4300"/>
-            <w:tcBorders>
-              <w:top w:val="single" w:color="9AA5A0" w:sz="4"/>
-              <w:left w:val="single" w:color="9AA5A0" w:sz="4"/>
-              <w:bottom w:val="single" w:color="9AA5A0" w:sz="4"/>
-              <w:right w:val="single" w:color="9AA5A0" w:sz="4"/>
-            </w:tcBorders>
-            <w:tcMar>
-              <w:top w:type="dxa" w:w="60"/>
-              <w:left w:type="dxa" w:w="100"/>
-              <w:bottom w:type="dxa" w:w="60"/>
-              <w:right w:type="dxa" w:w="100"/>
-            </w:tcMar>
-          </w:tcPr>
-          <w:p>
-            <w:pPr>
-              <w:spacing w:after="0"/>
-            </w:pPr>
-            <w:r>
-              <w:rPr>
-                <w:rFonts w:ascii="Arial" w:cs="Arial" w:eastAsia="Arial" w:hAnsi="Arial"/>
-                <w:b w:val="false"/>
-                <w:bCs w:val="false"/>
-                <w:sz w:val="19"/>
-                <w:szCs w:val="19"/>
-              </w:rPr>
               <w:t xml:space="preserve">Visita adicional</w:t>
             </w:r>
           </w:p>
@@ -6406,6 +6471,19 @@
         </w:tc>
       </w:tr>
     </w:tbl>
+    <w:p>
+      <w:pPr>
+        <w:spacing w:after="120" w:before="100"/>
+      </w:pPr>
+      <w:r>
+        <w:rPr>
+          <w:rFonts w:ascii="Arial" w:cs="Arial" w:eastAsia="Arial" w:hAnsi="Arial"/>
+          <w:sz w:val="21"/>
+          <w:szCs w:val="21"/>
+        </w:rPr>
+        <w:t xml:space="preserve">Retención en la fuente: si el cliente es agente retenedor (por ejemplo, una empresa), practicará la retención que corresponda según la ley y la descontará del valor a pagar, entregando el certificado de retención. La retención no se suma al valor de los honorarios. Las tarifas e impuestos aplicables se confirman con el contador antes de facturar.</w:t>
+      </w:r>
+    </w:p>
     <w:p>
       <w:pPr>
         <w:spacing w:after="60"/>

</xml_diff>